<commit_message>
feat: add complete documentation
</commit_message>
<xml_diff>
--- a/submission/Form-Submission.docx
+++ b/submission/Form-Submission.docx
@@ -153,25 +153,25 @@
           <w:sz w:val="24"/>
           <w:szCs w:val="24"/>
         </w:rPr>
-        <w:t xml:space="preserve"> yang membantu mahasiswa dan pencari kerja memahami kondisi dirinya, merencanakan pengembangan karier, serta menemukan peluang yang paling relevan untuk mencapai tujuan profesional. Orbit dikembangkan untuk menjawab permasalahan persiapan karier yang saat ini masih terfragmentasi, di mana pengguna harus mencari lowongan, mengevaluasi CV, belajar skill baru, mencari mentor, mengikuti event, dan mencatat perkembangan melalui berbagai platform yang berbeda tanpa arahan yang terintegrasi.</w:t>
-      </w:r>
-    </w:p>
-    <w:p>
-      <w:pPr>
-        <w:jc w:val="both"/>
-        <w:rPr>
-          <w:rFonts w:ascii="Arial" w:hAnsi="Arial" w:cs="Arial"/>
-          <w:sz w:val="24"/>
-          <w:szCs w:val="24"/>
-        </w:rPr>
-      </w:pPr>
-      <w:r>
-        <w:rPr>
-          <w:rFonts w:ascii="Arial" w:hAnsi="Arial" w:cs="Arial"/>
-          <w:sz w:val="24"/>
-          <w:szCs w:val="24"/>
-        </w:rPr>
-        <w:t xml:space="preserve">Melalui Orbit, pengguna dapat mengunggah CV dan menambahkan informasi seperti skill, pengalaman, minat, preferensi kerja, serta target karier. AI Agent kemudian menganalisis profil pengguna untuk mengidentifikasi kekuatan, career gap, dan tingkat kesiapan terhadap role yang dituju. Seluruh informasi tersebut divisualisasikan dalam </w:t>
+        <w:t xml:space="preserve"> yang membantu mahasiswa, fresh graduate, dan pencari kerja memahami posisi mereka saat ini, merencanakan pengembangan karier, serta menemukan peluang yang paling relevan untuk mencapai tujuan profesional. Orbit dikembangkan untuk menjawab permasalahan persiapan karier yang masih terfragmentasi, ketika pengguna harus mencari lowongan, mengevaluasi CV, mempelajari skill baru, mencari mentor, mengikuti event, membaca sumber belajar, dan mencatat perkembangan melalui berbagai platform yang berbeda tanpa arahan yang terintegrasi.</w:t>
+      </w:r>
+    </w:p>
+    <w:p>
+      <w:pPr>
+        <w:jc w:val="both"/>
+        <w:rPr>
+          <w:rFonts w:ascii="Arial" w:hAnsi="Arial" w:cs="Arial"/>
+          <w:sz w:val="24"/>
+          <w:szCs w:val="24"/>
+        </w:rPr>
+      </w:pPr>
+      <w:r>
+        <w:rPr>
+          <w:rFonts w:ascii="Arial" w:hAnsi="Arial" w:cs="Arial"/>
+          <w:sz w:val="24"/>
+          <w:szCs w:val="24"/>
+        </w:rPr>
+        <w:t xml:space="preserve">Melalui Orbit, pengguna dapat mengunggah CV dan menambahkan informasi seperti skill, pengalaman, minat, preferensi kerja, serta target karier. AI Agent kemudian menganalisis profil tersebut untuk mengidentifikasi kekuatan, career gap, tingkat kesiapan terhadap role yang dituju, serta peluang pengembangan yang paling relevan. Seluruh informasi divisualisasikan dalam </w:t>
       </w:r>
       <w:r>
         <w:rPr>
@@ -189,7 +189,7 @@
           <w:sz w:val="24"/>
           <w:szCs w:val="24"/>
         </w:rPr>
-        <w:t>, yaitu graph interaktif yang menghubungkan pengguna dengan skill, pengalaman, pekerjaan, mentor, buku, research paper, event, dan berbagai peluang pengembangan diri.</w:t>
+        <w:t>, yaitu graph interaktif yang menghubungkan pengguna dengan skill, pengalaman, pekerjaan, internship, mentor, buku, research paper, event, dan berbagai resources pengembangan diri.</w:t>
       </w:r>
     </w:p>
     <w:p>
@@ -225,7 +225,7 @@
           <w:sz w:val="24"/>
           <w:szCs w:val="24"/>
         </w:rPr>
-        <w:t xml:space="preserve"> berupa roadmap, milestone, dan quest yang dapat diselesaikan secara bertahap. Seiring pengguna menambah pengalaman dan progress, AI Agent akan memperbarui rekomendasi serta memberikan </w:t>
+        <w:t xml:space="preserve"> berupa roadmap, milestone, quest, dan progress yang dapat diselesaikan secara bertahap. Seiring pengguna menambah pengalaman, menyelesaikan aktivitas, atau memperbarui target, AI Agent akan menyesuaikan rekomendasi dan memberikan </w:t>
       </w:r>
       <w:r>
         <w:rPr>
@@ -261,25 +261,890 @@
           <w:sz w:val="24"/>
           <w:szCs w:val="24"/>
         </w:rPr>
-        <w:t xml:space="preserve">Dengan demikian, Orbit tidak hanya membantu pengguna menemukan pekerjaan, tetapi juga membantu mereka memahami </w:t>
-      </w:r>
-      <w:r>
-        <w:rPr>
-          <w:rFonts w:ascii="Arial" w:hAnsi="Arial" w:cs="Arial"/>
-          <w:b/>
-          <w:bCs/>
-          <w:sz w:val="24"/>
-          <w:szCs w:val="24"/>
-        </w:rPr>
-        <w:t>apa yang perlu dikembangkan, peluang apa yang sebaiknya diambil, dan langkah apa yang harus dilakukan selanjutnya</w:t>
-      </w:r>
-      <w:r>
-        <w:rPr>
-          <w:rFonts w:ascii="Arial" w:hAnsi="Arial" w:cs="Arial"/>
-          <w:sz w:val="24"/>
-          <w:szCs w:val="24"/>
-        </w:rPr>
-        <w:t xml:space="preserve"> agar semakin siap memasuki dunia kerja.</w:t>
+        <w:t xml:space="preserve">Dengan demikian, Orbit tidak hanya membantu pengguna menemukan pekerjaan, tetapi juga menjadi pendamping pengembangan karier yang membantu mereka memahami </w:t>
+      </w:r>
+      <w:r>
+        <w:rPr>
+          <w:rFonts w:ascii="Arial" w:hAnsi="Arial" w:cs="Arial"/>
+          <w:b/>
+          <w:bCs/>
+          <w:sz w:val="24"/>
+          <w:szCs w:val="24"/>
+        </w:rPr>
+        <w:t>apa yang perlu diperbaiki, peluang apa yang perlu diambil, dan langkah apa yang sebaiknya dilakukan selanjutnya</w:t>
+      </w:r>
+      <w:r>
+        <w:rPr>
+          <w:rFonts w:ascii="Arial" w:hAnsi="Arial" w:cs="Arial"/>
+          <w:sz w:val="24"/>
+          <w:szCs w:val="24"/>
+        </w:rPr>
+        <w:t xml:space="preserve"> agar semakin siap, kompetitif, dan percaya diri memasuki dunia kerja.</w:t>
+      </w:r>
+    </w:p>
+    <w:p>
+      <w:pPr>
+        <w:jc w:val="both"/>
+        <w:rPr>
+          <w:rFonts w:ascii="Arial" w:hAnsi="Arial" w:cs="Arial"/>
+          <w:sz w:val="24"/>
+          <w:szCs w:val="24"/>
+        </w:rPr>
+      </w:pPr>
+    </w:p>
+    <w:p>
+      <w:pPr>
+        <w:jc w:val="both"/>
+        <w:rPr>
+          <w:rFonts w:ascii="Arial" w:hAnsi="Arial" w:cs="Arial"/>
+          <w:b/>
+          <w:bCs/>
+          <w:sz w:val="24"/>
+          <w:szCs w:val="24"/>
+        </w:rPr>
+      </w:pPr>
+      <w:r>
+        <w:rPr>
+          <w:rFonts w:ascii="Arial" w:hAnsi="Arial" w:cs="Arial"/>
+          <w:b/>
+          <w:bCs/>
+          <w:sz w:val="24"/>
+          <w:szCs w:val="24"/>
+        </w:rPr>
+        <w:t>Problem Statement</w:t>
+      </w:r>
+      <w:r>
+        <w:rPr>
+          <w:rFonts w:ascii="Arial" w:hAnsi="Arial" w:cs="Arial"/>
+          <w:b/>
+          <w:bCs/>
+          <w:sz w:val="24"/>
+          <w:szCs w:val="24"/>
+        </w:rPr>
+        <w:t>:</w:t>
+      </w:r>
+    </w:p>
+    <w:p>
+      <w:pPr>
+        <w:jc w:val="both"/>
+        <w:rPr>
+          <w:rFonts w:ascii="Arial" w:hAnsi="Arial" w:cs="Arial"/>
+          <w:sz w:val="24"/>
+          <w:szCs w:val="24"/>
+        </w:rPr>
+      </w:pPr>
+      <w:r>
+        <w:rPr>
+          <w:rFonts w:ascii="Arial" w:hAnsi="Arial" w:cs="Arial"/>
+          <w:sz w:val="24"/>
+          <w:szCs w:val="24"/>
+        </w:rPr>
+        <w:t>Mahasiswa, fresh graduate, dan pencari kerja sering mengalami kesulitan dalam mempersiapkan karier karena prosesnya tersebar di banyak tempat dan tidak memiliki arah yang jelas. Mereka harus mencari lowongan melalui job portal, mengevaluasi CV secara terpisah, mencari skill yang perlu dipelajari, menemukan mentor atau role model, mengikuti event, membaca resource, hingga mencatat progress menggunakan platform yang berbeda-beda.</w:t>
+      </w:r>
+    </w:p>
+    <w:p>
+      <w:pPr>
+        <w:jc w:val="both"/>
+        <w:rPr>
+          <w:rFonts w:ascii="Arial" w:hAnsi="Arial" w:cs="Arial"/>
+          <w:sz w:val="24"/>
+          <w:szCs w:val="24"/>
+        </w:rPr>
+      </w:pPr>
+      <w:r>
+        <w:rPr>
+          <w:rFonts w:ascii="Arial" w:hAnsi="Arial" w:cs="Arial"/>
+          <w:sz w:val="24"/>
+          <w:szCs w:val="24"/>
+        </w:rPr>
+        <w:t xml:space="preserve">Kondisi ini membuat pengguna sering bingung menentukan </w:t>
+      </w:r>
+      <w:r>
+        <w:rPr>
+          <w:rFonts w:ascii="Arial" w:hAnsi="Arial" w:cs="Arial"/>
+          <w:b/>
+          <w:bCs/>
+          <w:sz w:val="24"/>
+          <w:szCs w:val="24"/>
+        </w:rPr>
+        <w:t>apa yang sebenarnya perlu diperbaiki, peluang mana yang paling relevan, dan langkah apa yang harus dilakukan terlebih dahulu</w:t>
+      </w:r>
+      <w:r>
+        <w:rPr>
+          <w:rFonts w:ascii="Arial" w:hAnsi="Arial" w:cs="Arial"/>
+          <w:sz w:val="24"/>
+          <w:szCs w:val="24"/>
+        </w:rPr>
+        <w:t xml:space="preserve"> untuk mencapai target karier mereka. Banyak </w:t>
+      </w:r>
+      <w:r>
+        <w:rPr>
+          <w:rFonts w:ascii="Arial" w:hAnsi="Arial" w:cs="Arial"/>
+          <w:sz w:val="24"/>
+          <w:szCs w:val="24"/>
+        </w:rPr>
+        <w:lastRenderedPageBreak/>
+        <w:t>pengguna juga belum memiliki cara yang terstruktur untuk menghubungkan pengalaman, skill, minat, dan tujuan karier menjadi satu perjalanan pengembangan yang jelas.</w:t>
+      </w:r>
+    </w:p>
+    <w:p>
+      <w:pPr>
+        <w:jc w:val="both"/>
+        <w:rPr>
+          <w:rFonts w:ascii="Arial" w:hAnsi="Arial" w:cs="Arial"/>
+          <w:sz w:val="24"/>
+          <w:szCs w:val="24"/>
+        </w:rPr>
+      </w:pPr>
+      <w:r>
+        <w:rPr>
+          <w:rFonts w:ascii="Arial" w:hAnsi="Arial" w:cs="Arial"/>
+          <w:sz w:val="24"/>
+          <w:szCs w:val="24"/>
+        </w:rPr>
+        <w:t>Akibatnya, proses persiapan karier menjadi tidak efisien, kurang personal, dan sulit dipantau. Pengguna dapat menghabiskan banyak waktu mencari informasi yang belum tentu relevan, melewatkan peluang penting, atau melakukan pengembangan diri tanpa mengetahui apakah aktivitas tersebut benar-benar mendukung tujuan karier mereka.</w:t>
+      </w:r>
+    </w:p>
+    <w:p>
+      <w:pPr>
+        <w:jc w:val="both"/>
+        <w:rPr>
+          <w:rFonts w:ascii="Arial" w:hAnsi="Arial" w:cs="Arial"/>
+          <w:sz w:val="24"/>
+          <w:szCs w:val="24"/>
+        </w:rPr>
+      </w:pPr>
+      <w:r>
+        <w:rPr>
+          <w:rFonts w:ascii="Arial" w:hAnsi="Arial" w:cs="Arial"/>
+          <w:sz w:val="24"/>
+          <w:szCs w:val="24"/>
+        </w:rPr>
+        <w:t xml:space="preserve">Masalah ini penting diselesaikan karena kesiapan kerja tidak hanya bergantung pada menemukan lowongan, tetapi juga pada kemampuan seseorang untuk </w:t>
+      </w:r>
+      <w:r>
+        <w:rPr>
+          <w:rFonts w:ascii="Arial" w:hAnsi="Arial" w:cs="Arial"/>
+          <w:b/>
+          <w:bCs/>
+          <w:sz w:val="24"/>
+          <w:szCs w:val="24"/>
+        </w:rPr>
+        <w:t>memahami posisi dirinya, mengetahui gap yang dimiliki, menentukan prioritas pengembangan, dan mengambil langkah yang tepat secara berkelanjutan</w:t>
+      </w:r>
+      <w:r>
+        <w:rPr>
+          <w:rFonts w:ascii="Arial" w:hAnsi="Arial" w:cs="Arial"/>
+          <w:sz w:val="24"/>
+          <w:szCs w:val="24"/>
+        </w:rPr>
+        <w:t>. Tanpa panduan yang terintegrasi, pengguna akan lebih sulit membangun perjalanan karier yang terarah dan adaptif.</w:t>
+      </w:r>
+    </w:p>
+    <w:p>
+      <w:pPr>
+        <w:jc w:val="both"/>
+        <w:rPr>
+          <w:rFonts w:ascii="Arial" w:hAnsi="Arial" w:cs="Arial"/>
+          <w:sz w:val="24"/>
+          <w:szCs w:val="24"/>
+        </w:rPr>
+      </w:pPr>
+    </w:p>
+    <w:p>
+      <w:pPr>
+        <w:jc w:val="both"/>
+        <w:rPr>
+          <w:rFonts w:ascii="Arial" w:hAnsi="Arial" w:cs="Arial"/>
+          <w:b/>
+          <w:bCs/>
+          <w:sz w:val="24"/>
+          <w:szCs w:val="24"/>
+        </w:rPr>
+      </w:pPr>
+      <w:r>
+        <w:rPr>
+          <w:rFonts w:ascii="Arial" w:hAnsi="Arial" w:cs="Arial"/>
+          <w:b/>
+          <w:bCs/>
+          <w:sz w:val="24"/>
+          <w:szCs w:val="24"/>
+        </w:rPr>
+        <w:t>Target Use</w:t>
+      </w:r>
+      <w:r>
+        <w:rPr>
+          <w:rFonts w:ascii="Arial" w:hAnsi="Arial" w:cs="Arial"/>
+          <w:b/>
+          <w:bCs/>
+          <w:sz w:val="24"/>
+          <w:szCs w:val="24"/>
+        </w:rPr>
+        <w:t>r</w:t>
+      </w:r>
+    </w:p>
+    <w:p>
+      <w:pPr>
+        <w:jc w:val="both"/>
+        <w:rPr>
+          <w:rFonts w:ascii="Arial" w:hAnsi="Arial" w:cs="Arial"/>
+          <w:sz w:val="24"/>
+          <w:szCs w:val="24"/>
+        </w:rPr>
+      </w:pPr>
+      <w:r>
+        <w:rPr>
+          <w:rFonts w:ascii="Arial" w:hAnsi="Arial" w:cs="Arial"/>
+          <w:sz w:val="24"/>
+          <w:szCs w:val="24"/>
+        </w:rPr>
+        <w:t xml:space="preserve">Pengguna utama </w:t>
+      </w:r>
+      <w:r>
+        <w:rPr>
+          <w:rFonts w:ascii="Arial" w:hAnsi="Arial" w:cs="Arial"/>
+          <w:b/>
+          <w:bCs/>
+          <w:sz w:val="24"/>
+          <w:szCs w:val="24"/>
+        </w:rPr>
+        <w:t>Orbit</w:t>
+      </w:r>
+      <w:r>
+        <w:rPr>
+          <w:rFonts w:ascii="Arial" w:hAnsi="Arial" w:cs="Arial"/>
+          <w:sz w:val="24"/>
+          <w:szCs w:val="24"/>
+        </w:rPr>
+        <w:t xml:space="preserve"> adalah </w:t>
+      </w:r>
+      <w:r>
+        <w:rPr>
+          <w:rFonts w:ascii="Arial" w:hAnsi="Arial" w:cs="Arial"/>
+          <w:b/>
+          <w:bCs/>
+          <w:sz w:val="24"/>
+          <w:szCs w:val="24"/>
+        </w:rPr>
+        <w:t>mahasiswa, fresh graduate, dan pencari kerja tahap awal</w:t>
+      </w:r>
+      <w:r>
+        <w:rPr>
+          <w:rFonts w:ascii="Arial" w:hAnsi="Arial" w:cs="Arial"/>
+          <w:sz w:val="24"/>
+          <w:szCs w:val="24"/>
+        </w:rPr>
+        <w:t xml:space="preserve"> yang sedang mempersiapkan diri untuk memasuki dunia kerja atau menentukan arah karier yang paling sesuai.</w:t>
+      </w:r>
+    </w:p>
+    <w:p>
+      <w:pPr>
+        <w:jc w:val="both"/>
+        <w:rPr>
+          <w:rFonts w:ascii="Arial" w:hAnsi="Arial" w:cs="Arial"/>
+          <w:sz w:val="24"/>
+          <w:szCs w:val="24"/>
+        </w:rPr>
+      </w:pPr>
+      <w:r>
+        <w:rPr>
+          <w:rFonts w:ascii="Arial" w:hAnsi="Arial" w:cs="Arial"/>
+          <w:sz w:val="24"/>
+          <w:szCs w:val="24"/>
+        </w:rPr>
+        <w:t>Target utama Orbit adalah pengguna yang:</w:t>
+      </w:r>
+    </w:p>
+    <w:p>
+      <w:pPr>
+        <w:numPr>
+          <w:ilvl w:val="0"/>
+          <w:numId w:val="1"/>
+        </w:numPr>
+        <w:jc w:val="both"/>
+        <w:rPr>
+          <w:rFonts w:ascii="Arial" w:hAnsi="Arial" w:cs="Arial"/>
+          <w:sz w:val="24"/>
+          <w:szCs w:val="24"/>
+        </w:rPr>
+      </w:pPr>
+      <w:r>
+        <w:rPr>
+          <w:rFonts w:ascii="Arial" w:hAnsi="Arial" w:cs="Arial"/>
+          <w:sz w:val="24"/>
+          <w:szCs w:val="24"/>
+        </w:rPr>
+        <w:t>belum yakin terhadap jalur karier yang ingin dipilih,</w:t>
+      </w:r>
+    </w:p>
+    <w:p>
+      <w:pPr>
+        <w:numPr>
+          <w:ilvl w:val="0"/>
+          <w:numId w:val="1"/>
+        </w:numPr>
+        <w:jc w:val="both"/>
+        <w:rPr>
+          <w:rFonts w:ascii="Arial" w:hAnsi="Arial" w:cs="Arial"/>
+          <w:sz w:val="24"/>
+          <w:szCs w:val="24"/>
+        </w:rPr>
+      </w:pPr>
+      <w:r>
+        <w:rPr>
+          <w:rFonts w:ascii="Arial" w:hAnsi="Arial" w:cs="Arial"/>
+          <w:sz w:val="24"/>
+          <w:szCs w:val="24"/>
+        </w:rPr>
+        <w:t>ingin mengetahui skill dan pengalaman apa yang masih perlu ditingkatkan,</w:t>
+      </w:r>
+    </w:p>
+    <w:p>
+      <w:pPr>
+        <w:numPr>
+          <w:ilvl w:val="0"/>
+          <w:numId w:val="1"/>
+        </w:numPr>
+        <w:jc w:val="both"/>
+        <w:rPr>
+          <w:rFonts w:ascii="Arial" w:hAnsi="Arial" w:cs="Arial"/>
+          <w:sz w:val="24"/>
+          <w:szCs w:val="24"/>
+        </w:rPr>
+      </w:pPr>
+      <w:r>
+        <w:rPr>
+          <w:rFonts w:ascii="Arial" w:hAnsi="Arial" w:cs="Arial"/>
+          <w:sz w:val="24"/>
+          <w:szCs w:val="24"/>
+        </w:rPr>
+        <w:t>membutuhkan rekomendasi pekerjaan atau internship yang relevan,</w:t>
+      </w:r>
+    </w:p>
+    <w:p>
+      <w:pPr>
+        <w:numPr>
+          <w:ilvl w:val="0"/>
+          <w:numId w:val="1"/>
+        </w:numPr>
+        <w:jc w:val="both"/>
+        <w:rPr>
+          <w:rFonts w:ascii="Arial" w:hAnsi="Arial" w:cs="Arial"/>
+          <w:sz w:val="24"/>
+          <w:szCs w:val="24"/>
+        </w:rPr>
+      </w:pPr>
+      <w:r>
+        <w:rPr>
+          <w:rFonts w:ascii="Arial" w:hAnsi="Arial" w:cs="Arial"/>
+          <w:sz w:val="24"/>
+          <w:szCs w:val="24"/>
+        </w:rPr>
+        <w:t>ingin mendapatkan arahan pengembangan diri yang lebih terstruktur,</w:t>
+      </w:r>
+    </w:p>
+    <w:p>
+      <w:pPr>
+        <w:numPr>
+          <w:ilvl w:val="0"/>
+          <w:numId w:val="1"/>
+        </w:numPr>
+        <w:jc w:val="both"/>
+        <w:rPr>
+          <w:rFonts w:ascii="Arial" w:hAnsi="Arial" w:cs="Arial"/>
+          <w:sz w:val="24"/>
+          <w:szCs w:val="24"/>
+        </w:rPr>
+      </w:pPr>
+      <w:r>
+        <w:rPr>
+          <w:rFonts w:ascii="Arial" w:hAnsi="Arial" w:cs="Arial"/>
+          <w:sz w:val="24"/>
+          <w:szCs w:val="24"/>
+        </w:rPr>
+        <w:t>dan ingin memantau progress karier dalam satu platform.</w:t>
+      </w:r>
+    </w:p>
+    <w:p>
+      <w:pPr>
+        <w:jc w:val="both"/>
+        <w:rPr>
+          <w:rFonts w:ascii="Arial" w:hAnsi="Arial" w:cs="Arial"/>
+          <w:sz w:val="24"/>
+          <w:szCs w:val="24"/>
+        </w:rPr>
+      </w:pPr>
+      <w:r>
+        <w:rPr>
+          <w:rFonts w:ascii="Arial" w:hAnsi="Arial" w:cs="Arial"/>
+          <w:sz w:val="24"/>
+          <w:szCs w:val="24"/>
+        </w:rPr>
+        <w:t>Orbit juga cocok untuk mahasiswa yang masih membangun pengalaman melalui organisasi, kompetisi, project, internship, course, seminar, atau aktivitas pengembangan lainnya, tetapi belum mengetahui bagaimana semua pengalaman tersebut dapat mendukung target karier mereka.</w:t>
+      </w:r>
+    </w:p>
+    <w:p>
+      <w:pPr>
+        <w:jc w:val="both"/>
+        <w:rPr>
+          <w:rFonts w:ascii="Arial" w:hAnsi="Arial" w:cs="Arial"/>
+          <w:sz w:val="24"/>
+          <w:szCs w:val="24"/>
+        </w:rPr>
+      </w:pPr>
+      <w:r>
+        <w:rPr>
+          <w:rFonts w:ascii="Arial" w:hAnsi="Arial" w:cs="Arial"/>
+          <w:sz w:val="24"/>
+          <w:szCs w:val="24"/>
+        </w:rPr>
+        <w:t>Dengan memahami CV, skill, pengalaman, minat, preferensi, dan tujuan pengguna, Orbit membantu setiap user mendapatkan rekomendasi dan perjalanan karier yang lebih personal, terarah, dan sesuai dengan kondisi mereka saat ini.</w:t>
+      </w:r>
+    </w:p>
+    <w:p>
+      <w:pPr>
+        <w:jc w:val="both"/>
+        <w:rPr>
+          <w:rFonts w:ascii="Arial" w:hAnsi="Arial" w:cs="Arial"/>
+          <w:sz w:val="24"/>
+          <w:szCs w:val="24"/>
+        </w:rPr>
+      </w:pPr>
+    </w:p>
+    <w:p>
+      <w:pPr>
+        <w:jc w:val="both"/>
+        <w:rPr>
+          <w:rFonts w:ascii="Arial" w:hAnsi="Arial" w:cs="Arial"/>
+          <w:b/>
+          <w:bCs/>
+          <w:sz w:val="24"/>
+          <w:szCs w:val="24"/>
+        </w:rPr>
+      </w:pPr>
+    </w:p>
+    <w:p>
+      <w:pPr>
+        <w:jc w:val="both"/>
+        <w:rPr>
+          <w:rFonts w:ascii="Arial" w:hAnsi="Arial" w:cs="Arial"/>
+          <w:sz w:val="24"/>
+          <w:szCs w:val="24"/>
+        </w:rPr>
+      </w:pPr>
+      <w:r>
+        <w:rPr>
+          <w:rFonts w:ascii="Arial" w:hAnsi="Arial" w:cs="Arial"/>
+          <w:b/>
+          <w:bCs/>
+          <w:sz w:val="24"/>
+          <w:szCs w:val="24"/>
+        </w:rPr>
+        <w:t>Mengapa Solusi Ini Dibutuhkan?</w:t>
+      </w:r>
+    </w:p>
+    <w:p>
+      <w:pPr>
+        <w:jc w:val="both"/>
+        <w:rPr>
+          <w:rFonts w:ascii="Arial" w:hAnsi="Arial" w:cs="Arial"/>
+          <w:sz w:val="24"/>
+          <w:szCs w:val="24"/>
+        </w:rPr>
+      </w:pPr>
+    </w:p>
+    <w:p>
+      <w:pPr>
+        <w:jc w:val="both"/>
+        <w:rPr>
+          <w:rFonts w:ascii="Arial" w:hAnsi="Arial" w:cs="Arial"/>
+          <w:b/>
+          <w:bCs/>
+          <w:sz w:val="24"/>
+          <w:szCs w:val="24"/>
+        </w:rPr>
+      </w:pPr>
+      <w:r>
+        <w:rPr>
+          <w:rFonts w:ascii="Arial" w:hAnsi="Arial" w:cs="Arial"/>
+          <w:b/>
+          <w:bCs/>
+          <w:sz w:val="24"/>
+          <w:szCs w:val="24"/>
+        </w:rPr>
+        <w:t>Fitur Utama Project</w:t>
+      </w:r>
+    </w:p>
+    <w:p>
+      <w:pPr>
+        <w:jc w:val="both"/>
+        <w:rPr>
+          <w:rFonts w:ascii="Arial" w:hAnsi="Arial" w:cs="Arial"/>
+          <w:b/>
+          <w:bCs/>
+          <w:sz w:val="24"/>
+          <w:szCs w:val="24"/>
+        </w:rPr>
+      </w:pPr>
+    </w:p>
+    <w:p>
+      <w:pPr>
+        <w:jc w:val="both"/>
+        <w:rPr>
+          <w:rFonts w:ascii="Arial" w:hAnsi="Arial" w:cs="Arial"/>
+          <w:b/>
+          <w:bCs/>
+          <w:sz w:val="24"/>
+          <w:szCs w:val="24"/>
+        </w:rPr>
+      </w:pPr>
+      <w:r>
+        <w:rPr>
+          <w:rFonts w:ascii="Arial" w:hAnsi="Arial" w:cs="Arial"/>
+          <w:b/>
+          <w:bCs/>
+          <w:sz w:val="24"/>
+          <w:szCs w:val="24"/>
+        </w:rPr>
+        <w:t>Alur Penggunaan Project</w:t>
+      </w:r>
+    </w:p>
+    <w:p>
+      <w:pPr>
+        <w:jc w:val="both"/>
+        <w:rPr>
+          <w:rFonts w:ascii="Arial" w:hAnsi="Arial" w:cs="Arial"/>
+          <w:b/>
+          <w:bCs/>
+          <w:sz w:val="24"/>
+          <w:szCs w:val="24"/>
+        </w:rPr>
+      </w:pPr>
+    </w:p>
+    <w:p>
+      <w:pPr>
+        <w:jc w:val="both"/>
+        <w:rPr>
+          <w:rFonts w:ascii="Arial" w:hAnsi="Arial" w:cs="Arial"/>
+          <w:b/>
+          <w:bCs/>
+          <w:sz w:val="24"/>
+          <w:szCs w:val="24"/>
+        </w:rPr>
+      </w:pPr>
+      <w:r>
+        <w:rPr>
+          <w:rFonts w:ascii="Arial" w:hAnsi="Arial" w:cs="Arial"/>
+          <w:b/>
+          <w:bCs/>
+          <w:sz w:val="24"/>
+          <w:szCs w:val="24"/>
+        </w:rPr>
+        <w:t>Penggunaan IBM Langflow</w:t>
+      </w:r>
+    </w:p>
+    <w:p>
+      <w:pPr>
+        <w:jc w:val="both"/>
+        <w:rPr>
+          <w:rFonts w:ascii="Arial" w:hAnsi="Arial" w:cs="Arial"/>
+          <w:b/>
+          <w:bCs/>
+          <w:sz w:val="24"/>
+          <w:szCs w:val="24"/>
+        </w:rPr>
+      </w:pPr>
+    </w:p>
+    <w:p>
+      <w:pPr>
+        <w:jc w:val="both"/>
+        <w:rPr>
+          <w:rFonts w:ascii="Arial" w:hAnsi="Arial" w:cs="Arial"/>
+          <w:b/>
+          <w:bCs/>
+          <w:sz w:val="24"/>
+          <w:szCs w:val="24"/>
+        </w:rPr>
+      </w:pPr>
+      <w:r>
+        <w:rPr>
+          <w:rFonts w:ascii="Arial" w:hAnsi="Arial" w:cs="Arial"/>
+          <w:b/>
+          <w:bCs/>
+          <w:sz w:val="24"/>
+          <w:szCs w:val="24"/>
+        </w:rPr>
+        <w:t>Penggunaan IBM Bob</w:t>
+      </w:r>
+    </w:p>
+    <w:p>
+      <w:pPr>
+        <w:jc w:val="both"/>
+        <w:rPr>
+          <w:rFonts w:ascii="Arial" w:hAnsi="Arial" w:cs="Arial"/>
+          <w:b/>
+          <w:bCs/>
+          <w:sz w:val="24"/>
+          <w:szCs w:val="24"/>
+        </w:rPr>
+      </w:pPr>
+    </w:p>
+    <w:p>
+      <w:pPr>
+        <w:jc w:val="both"/>
+        <w:rPr>
+          <w:rFonts w:ascii="Arial" w:hAnsi="Arial" w:cs="Arial"/>
+          <w:b/>
+          <w:bCs/>
+          <w:sz w:val="24"/>
+          <w:szCs w:val="24"/>
+        </w:rPr>
+      </w:pPr>
+      <w:r>
+        <w:rPr>
+          <w:rFonts w:ascii="Arial" w:hAnsi="Arial" w:cs="Arial"/>
+          <w:b/>
+          <w:bCs/>
+          <w:sz w:val="24"/>
+          <w:szCs w:val="24"/>
+        </w:rPr>
+        <w:t>Bagaimana IBM Langflow dan IBM Bob Terintegrasi?</w:t>
+      </w:r>
+    </w:p>
+    <w:p>
+      <w:pPr>
+        <w:jc w:val="both"/>
+        <w:rPr>
+          <w:rFonts w:ascii="Arial" w:hAnsi="Arial" w:cs="Arial"/>
+          <w:b/>
+          <w:bCs/>
+          <w:sz w:val="24"/>
+          <w:szCs w:val="24"/>
+        </w:rPr>
+      </w:pPr>
+    </w:p>
+    <w:p>
+      <w:pPr>
+        <w:jc w:val="both"/>
+        <w:rPr>
+          <w:rFonts w:ascii="Arial" w:hAnsi="Arial" w:cs="Arial"/>
+          <w:b/>
+          <w:bCs/>
+          <w:sz w:val="24"/>
+          <w:szCs w:val="24"/>
+        </w:rPr>
+      </w:pPr>
+      <w:r>
+        <w:rPr>
+          <w:rFonts w:ascii="Arial" w:hAnsi="Arial" w:cs="Arial"/>
+          <w:b/>
+          <w:bCs/>
+          <w:sz w:val="24"/>
+          <w:szCs w:val="24"/>
+        </w:rPr>
+        <w:t>Project File / Link</w:t>
+      </w:r>
+    </w:p>
+    <w:p>
+      <w:pPr>
+        <w:jc w:val="both"/>
+        <w:rPr>
+          <w:rFonts w:ascii="Arial" w:hAnsi="Arial" w:cs="Arial"/>
+          <w:b/>
+          <w:bCs/>
+          <w:sz w:val="24"/>
+          <w:szCs w:val="24"/>
+        </w:rPr>
+      </w:pPr>
+    </w:p>
+    <w:p>
+      <w:pPr>
+        <w:jc w:val="both"/>
+        <w:rPr>
+          <w:rFonts w:ascii="Arial" w:hAnsi="Arial" w:cs="Arial"/>
+          <w:b/>
+          <w:bCs/>
+          <w:sz w:val="24"/>
+          <w:szCs w:val="24"/>
+        </w:rPr>
+      </w:pPr>
+      <w:r>
+        <w:rPr>
+          <w:rFonts w:ascii="Arial" w:hAnsi="Arial" w:cs="Arial"/>
+          <w:b/>
+          <w:bCs/>
+          <w:sz w:val="24"/>
+          <w:szCs w:val="24"/>
+        </w:rPr>
+        <w:t>Pitching Deck</w:t>
+      </w:r>
+    </w:p>
+    <w:p>
+      <w:pPr>
+        <w:jc w:val="both"/>
+        <w:rPr>
+          <w:rFonts w:ascii="Arial" w:hAnsi="Arial" w:cs="Arial"/>
+          <w:b/>
+          <w:bCs/>
+          <w:sz w:val="24"/>
+          <w:szCs w:val="24"/>
+        </w:rPr>
+      </w:pPr>
+    </w:p>
+    <w:p>
+      <w:pPr>
+        <w:jc w:val="both"/>
+        <w:rPr>
+          <w:rFonts w:ascii="Arial" w:hAnsi="Arial" w:cs="Arial"/>
+          <w:b/>
+          <w:bCs/>
+          <w:sz w:val="24"/>
+          <w:szCs w:val="24"/>
+        </w:rPr>
+      </w:pPr>
+      <w:r>
+        <w:rPr>
+          <w:rFonts w:ascii="Arial" w:hAnsi="Arial" w:cs="Arial"/>
+          <w:b/>
+          <w:bCs/>
+          <w:sz w:val="24"/>
+          <w:szCs w:val="24"/>
+        </w:rPr>
+        <w:t>Project / Prototype Screenshot</w:t>
+      </w:r>
+    </w:p>
+    <w:p>
+      <w:pPr>
+        <w:jc w:val="both"/>
+        <w:rPr>
+          <w:rFonts w:ascii="Arial" w:hAnsi="Arial" w:cs="Arial"/>
+          <w:b/>
+          <w:bCs/>
+          <w:sz w:val="24"/>
+          <w:szCs w:val="24"/>
+        </w:rPr>
+      </w:pPr>
+    </w:p>
+    <w:p>
+      <w:pPr>
+        <w:jc w:val="both"/>
+        <w:rPr>
+          <w:rFonts w:ascii="Arial" w:hAnsi="Arial" w:cs="Arial"/>
+          <w:b/>
+          <w:bCs/>
+          <w:sz w:val="24"/>
+          <w:szCs w:val="24"/>
+        </w:rPr>
+      </w:pPr>
+      <w:r>
+        <w:rPr>
+          <w:rFonts w:ascii="Arial" w:hAnsi="Arial" w:cs="Arial"/>
+          <w:b/>
+          <w:bCs/>
+          <w:sz w:val="24"/>
+          <w:szCs w:val="24"/>
+        </w:rPr>
+        <w:t>Dampak yang Dihasilkan</w:t>
+      </w:r>
+    </w:p>
+    <w:p>
+      <w:pPr>
+        <w:jc w:val="both"/>
+        <w:rPr>
+          <w:rFonts w:ascii="Arial" w:hAnsi="Arial" w:cs="Arial"/>
+          <w:b/>
+          <w:bCs/>
+          <w:sz w:val="24"/>
+          <w:szCs w:val="24"/>
+        </w:rPr>
+      </w:pPr>
+    </w:p>
+    <w:p>
+      <w:pPr>
+        <w:jc w:val="both"/>
+        <w:rPr>
+          <w:rFonts w:ascii="Arial" w:hAnsi="Arial" w:cs="Arial"/>
+          <w:b/>
+          <w:bCs/>
+          <w:sz w:val="24"/>
+          <w:szCs w:val="24"/>
+        </w:rPr>
+      </w:pPr>
+      <w:r>
+        <w:rPr>
+          <w:rFonts w:ascii="Arial" w:hAnsi="Arial" w:cs="Arial"/>
+          <w:b/>
+          <w:bCs/>
+          <w:sz w:val="24"/>
+          <w:szCs w:val="24"/>
+        </w:rPr>
+        <w:t>Potensi Pengembangan &amp; Skalabilitas</w:t>
+      </w:r>
+    </w:p>
+    <w:p>
+      <w:pPr>
+        <w:jc w:val="both"/>
+        <w:rPr>
+          <w:rFonts w:ascii="Arial" w:hAnsi="Arial" w:cs="Arial"/>
+          <w:b/>
+          <w:bCs/>
+          <w:sz w:val="24"/>
+          <w:szCs w:val="24"/>
+        </w:rPr>
+      </w:pPr>
+    </w:p>
+    <w:p>
+      <w:pPr>
+        <w:jc w:val="both"/>
+        <w:rPr>
+          <w:rFonts w:ascii="Arial" w:hAnsi="Arial" w:cs="Arial"/>
+          <w:b/>
+          <w:bCs/>
+          <w:sz w:val="24"/>
+          <w:szCs w:val="24"/>
+        </w:rPr>
+      </w:pPr>
+      <w:r>
+        <w:rPr>
+          <w:rFonts w:ascii="Arial" w:hAnsi="Arial" w:cs="Arial"/>
+          <w:b/>
+          <w:bCs/>
+          <w:sz w:val="24"/>
+          <w:szCs w:val="24"/>
+        </w:rPr>
+        <w:t>Apa yang Membuat Project Ini Berbeda?</w:t>
+      </w:r>
+    </w:p>
+    <w:p>
+      <w:pPr>
+        <w:jc w:val="both"/>
+        <w:rPr>
+          <w:rFonts w:ascii="Arial" w:hAnsi="Arial" w:cs="Arial"/>
+          <w:b/>
+          <w:bCs/>
+          <w:sz w:val="24"/>
+          <w:szCs w:val="24"/>
+        </w:rPr>
+      </w:pPr>
+    </w:p>
+    <w:p>
+      <w:pPr>
+        <w:jc w:val="both"/>
+        <w:rPr>
+          <w:rFonts w:ascii="Arial" w:hAnsi="Arial" w:cs="Arial"/>
+          <w:sz w:val="24"/>
+          <w:szCs w:val="24"/>
+        </w:rPr>
+      </w:pPr>
+      <w:r>
+        <w:rPr>
+          <w:rFonts w:ascii="Arial" w:hAnsi="Arial" w:cs="Arial"/>
+          <w:b/>
+          <w:bCs/>
+          <w:sz w:val="24"/>
+          <w:szCs w:val="24"/>
+        </w:rPr>
+        <w:t>Kemampuan AI Agent</w:t>
       </w:r>
     </w:p>
     <w:sectPr>
@@ -290,6 +1155,163 @@
     </w:sectPr>
   </w:body>
 </w:document>
+</file>
+
+<file path=word/numbering.xml><?xml version="1.0" encoding="utf-8"?>
+<w:numbering xmlns:wpc="http://schemas.microsoft.com/office/word/2010/wordprocessingCanvas" xmlns:cx="http://schemas.microsoft.com/office/drawing/2014/chartex" xmlns:cx1="http://schemas.microsoft.com/office/drawing/2015/9/8/chartex" xmlns:cx2="http://schemas.microsoft.com/office/drawing/2015/10/21/chartex" xmlns:cx3="http://schemas.microsoft.com/office/drawing/2016/5/9/chartex" xmlns:cx4="http://schemas.microsoft.com/office/drawing/2016/5/10/chartex" xmlns:cx5="http://schemas.microsoft.com/office/drawing/2016/5/11/chartex" xmlns:cx6="http://schemas.microsoft.com/office/drawing/2016/5/12/chartex" xmlns:cx7="http://schemas.microsoft.com/office/drawing/2016/5/13/chartex" xmlns:cx8="http://schemas.microsoft.com/office/drawing/2016/5/14/chartex" xmlns:mc="http://schemas.openxmlformats.org/markup-compatibility/2006" xmlns:aink="http://schemas.microsoft.com/office/drawing/2016/ink" xmlns:am3d="http://schemas.microsoft.com/office/drawing/2017/model3d" xmlns:o="urn:schemas-microsoft-com:office:office" xmlns:oel="http://schemas.microsoft.com/office/2019/extlst" xmlns:r="http://schemas.openxmlformats.org/officeDocument/2006/relationships" xmlns:m="http://schemas.openxmlformats.org/officeDocument/2006/math" xmlns:v="urn:schemas-microsoft-com:vml" xmlns:wp14="http://schemas.microsoft.com/office/word/2010/wordprocessingDrawing" xmlns:wp="http://schemas.openxmlformats.org/drawingml/2006/wordprocessingDrawing" xmlns:w10="urn:schemas-microsoft-com:office:word" xmlns:w="http://schemas.openxmlformats.org/wordprocessingml/2006/main" xmlns:w14="http://schemas.microsoft.com/office/word/2010/wordml" xmlns:w15="http://schemas.microsoft.com/office/word/2012/wordml" xmlns:w16cex="http://schemas.microsoft.com/office/word/2018/wordml/cex" xmlns:w16cid="http://schemas.microsoft.com/office/word/2016/wordml/cid" xmlns:w16="http://schemas.microsoft.com/office/word/2018/wordml" xmlns:w16du="http://schemas.microsoft.com/office/word/2023/wordml/word16du" xmlns:w16sdtdh="http://schemas.microsoft.com/office/word/2020/wordml/sdtdatahash" xmlns:w16sdtfl="http://schemas.microsoft.com/office/word/2024/wordml/sdtformatlock" xmlns:w16se="http://schemas.microsoft.com/office/word/2015/wordml/symex" xmlns:wpg="http://schemas.microsoft.com/office/word/2010/wordprocessingGroup" xmlns:wpi="http://schemas.microsoft.com/office/word/2010/wordprocessingInk" xmlns:wne="http://schemas.microsoft.com/office/word/2006/wordml" xmlns:wps="http://schemas.microsoft.com/office/word/2010/wordprocessingShape" mc:Ignorable="w14 w15 w16se w16cid w16 w16cex w16sdtdh w16sdtfl w16du wp14">
+  <w:abstractNum w:abstractNumId="0" w15:restartNumberingAfterBreak="0">
+    <w:nsid w:val="0A836890"/>
+    <w:multiLevelType w:val="multilevel"/>
+    <w:tmpl w:val="47B0B428"/>
+    <w:lvl w:ilvl="0">
+      <w:start w:val="1"/>
+      <w:numFmt w:val="bullet"/>
+      <w:lvlText w:val=""/>
+      <w:lvlJc w:val="left"/>
+      <w:pPr>
+        <w:tabs>
+          <w:tab w:val="num" w:pos="720"/>
+        </w:tabs>
+        <w:ind w:left="720" w:hanging="360"/>
+      </w:pPr>
+      <w:rPr>
+        <w:rFonts w:ascii="Symbol" w:hAnsi="Symbol" w:hint="default"/>
+        <w:sz w:val="20"/>
+      </w:rPr>
+    </w:lvl>
+    <w:lvl w:ilvl="1" w:tentative="1">
+      <w:start w:val="1"/>
+      <w:numFmt w:val="bullet"/>
+      <w:lvlText w:val="o"/>
+      <w:lvlJc w:val="left"/>
+      <w:pPr>
+        <w:tabs>
+          <w:tab w:val="num" w:pos="1440"/>
+        </w:tabs>
+        <w:ind w:left="1440" w:hanging="360"/>
+      </w:pPr>
+      <w:rPr>
+        <w:rFonts w:ascii="Courier New" w:hAnsi="Courier New" w:hint="default"/>
+        <w:sz w:val="20"/>
+      </w:rPr>
+    </w:lvl>
+    <w:lvl w:ilvl="2" w:tentative="1">
+      <w:start w:val="1"/>
+      <w:numFmt w:val="bullet"/>
+      <w:lvlText w:val=""/>
+      <w:lvlJc w:val="left"/>
+      <w:pPr>
+        <w:tabs>
+          <w:tab w:val="num" w:pos="2160"/>
+        </w:tabs>
+        <w:ind w:left="2160" w:hanging="360"/>
+      </w:pPr>
+      <w:rPr>
+        <w:rFonts w:ascii="Wingdings" w:hAnsi="Wingdings" w:hint="default"/>
+        <w:sz w:val="20"/>
+      </w:rPr>
+    </w:lvl>
+    <w:lvl w:ilvl="3" w:tentative="1">
+      <w:start w:val="1"/>
+      <w:numFmt w:val="bullet"/>
+      <w:lvlText w:val=""/>
+      <w:lvlJc w:val="left"/>
+      <w:pPr>
+        <w:tabs>
+          <w:tab w:val="num" w:pos="2880"/>
+        </w:tabs>
+        <w:ind w:left="2880" w:hanging="360"/>
+      </w:pPr>
+      <w:rPr>
+        <w:rFonts w:ascii="Wingdings" w:hAnsi="Wingdings" w:hint="default"/>
+        <w:sz w:val="20"/>
+      </w:rPr>
+    </w:lvl>
+    <w:lvl w:ilvl="4" w:tentative="1">
+      <w:start w:val="1"/>
+      <w:numFmt w:val="bullet"/>
+      <w:lvlText w:val=""/>
+      <w:lvlJc w:val="left"/>
+      <w:pPr>
+        <w:tabs>
+          <w:tab w:val="num" w:pos="3600"/>
+        </w:tabs>
+        <w:ind w:left="3600" w:hanging="360"/>
+      </w:pPr>
+      <w:rPr>
+        <w:rFonts w:ascii="Wingdings" w:hAnsi="Wingdings" w:hint="default"/>
+        <w:sz w:val="20"/>
+      </w:rPr>
+    </w:lvl>
+    <w:lvl w:ilvl="5" w:tentative="1">
+      <w:start w:val="1"/>
+      <w:numFmt w:val="bullet"/>
+      <w:lvlText w:val=""/>
+      <w:lvlJc w:val="left"/>
+      <w:pPr>
+        <w:tabs>
+          <w:tab w:val="num" w:pos="4320"/>
+        </w:tabs>
+        <w:ind w:left="4320" w:hanging="360"/>
+      </w:pPr>
+      <w:rPr>
+        <w:rFonts w:ascii="Wingdings" w:hAnsi="Wingdings" w:hint="default"/>
+        <w:sz w:val="20"/>
+      </w:rPr>
+    </w:lvl>
+    <w:lvl w:ilvl="6" w:tentative="1">
+      <w:start w:val="1"/>
+      <w:numFmt w:val="bullet"/>
+      <w:lvlText w:val=""/>
+      <w:lvlJc w:val="left"/>
+      <w:pPr>
+        <w:tabs>
+          <w:tab w:val="num" w:pos="5040"/>
+        </w:tabs>
+        <w:ind w:left="5040" w:hanging="360"/>
+      </w:pPr>
+      <w:rPr>
+        <w:rFonts w:ascii="Wingdings" w:hAnsi="Wingdings" w:hint="default"/>
+        <w:sz w:val="20"/>
+      </w:rPr>
+    </w:lvl>
+    <w:lvl w:ilvl="7" w:tentative="1">
+      <w:start w:val="1"/>
+      <w:numFmt w:val="bullet"/>
+      <w:lvlText w:val=""/>
+      <w:lvlJc w:val="left"/>
+      <w:pPr>
+        <w:tabs>
+          <w:tab w:val="num" w:pos="5760"/>
+        </w:tabs>
+        <w:ind w:left="5760" w:hanging="360"/>
+      </w:pPr>
+      <w:rPr>
+        <w:rFonts w:ascii="Wingdings" w:hAnsi="Wingdings" w:hint="default"/>
+        <w:sz w:val="20"/>
+      </w:rPr>
+    </w:lvl>
+    <w:lvl w:ilvl="8" w:tentative="1">
+      <w:start w:val="1"/>
+      <w:numFmt w:val="bullet"/>
+      <w:lvlText w:val=""/>
+      <w:lvlJc w:val="left"/>
+      <w:pPr>
+        <w:tabs>
+          <w:tab w:val="num" w:pos="6480"/>
+        </w:tabs>
+        <w:ind w:left="6480" w:hanging="360"/>
+      </w:pPr>
+      <w:rPr>
+        <w:rFonts w:ascii="Wingdings" w:hAnsi="Wingdings" w:hint="default"/>
+        <w:sz w:val="20"/>
+      </w:rPr>
+    </w:lvl>
+  </w:abstractNum>
+  <w:num w:numId="1" w16cid:durableId="1897739290">
+    <w:abstractNumId w:val="0"/>
+  </w:num>
+</w:numbering>
 </file>
 
 <file path=word/styles.xml><?xml version="1.0" encoding="utf-8"?>

</xml_diff>